<commit_message>
Regenerate Dr Timbo example outputs with the fixed design drawing
The example figure and the two reports embedding it were still the
old drawing because the builders only draw the figure when the file
is missing.

Co-Authored-By: Claude Fable 5 <noreply@anthropic.com>
Claude-Session: https://claude.ai/code/session_01PuszPvVjSRhmgR52UbHySx
</commit_message>
<xml_diff>
--- a/examples/projects/dr_timbo/reports/Dr_Timbo_Borehole_Completion_Report.docx
+++ b/examples/projects/dr_timbo/reports/Dr_Timbo_Borehole_Completion_Report.docx
@@ -2454,7 +2454,7 @@
       <w:r>
         <w:drawing>
           <wp:inline xmlns:a="http://schemas.openxmlformats.org/drawingml/2006/main" xmlns:pic="http://schemas.openxmlformats.org/drawingml/2006/picture">
-            <wp:extent cx="4860000" cy="5534715"/>
+            <wp:extent cx="4860000" cy="5538140"/>
             <wp:docPr id="1" name="Picture 1"/>
             <wp:cNvGraphicFramePr>
               <a:graphicFrameLocks noChangeAspect="1"/>
@@ -2475,7 +2475,7 @@
                   <pic:spPr>
                     <a:xfrm>
                       <a:off x="0" y="0"/>
-                      <a:ext cx="4860000" cy="5534715"/>
+                      <a:ext cx="4860000" cy="5538140"/>
                     </a:xfrm>
                     <a:prstGeom prst="rect"/>
                   </pic:spPr>

</xml_diff>